<commit_message>
docs: sharpen positioning, add Qwen visibility, compress demo script
- Narrow one-liner to '首单前的证据决策系统' with Go/Validate/Stop framing
- Add competitor differentiation (vs Jungle Scout, generic AI assistants)
- Add TAM/SAM/SOM market sizing and concrete pricing tiers
- Add Qwen Grounding mechanism section with call flow diagram
- Add deprecation banner to PRD v1.0 (Streamlit/LangGraph/Gemini)
- Rewrite demo script: 4:30 target, first 60s business-only
- Add second Hybrid case: US coffee grinder (public data + Qwen)
- Regenerate competition docx with v3 improvements

Co-Authored-By: Claude Opus 4.8 <noreply@anthropic.com>
</commit_message>
<xml_diff>
--- a/deliverables/菜菜唠唠_先机罗盘_复赛作品.docx
+++ b/deliverables/菜菜唠唠_先机罗盘_复赛作品.docx
@@ -20,7 +20,7 @@
         <w:pStyle w:val="Heading1"/>
       </w:pPr>
       <w:r>
-        <w:t>一、团队信息（必填基本信息）</w:t>
+        <w:t>一、团队信息</w:t>
       </w:r>
     </w:p>
     <w:tbl>
@@ -459,7 +459,7 @@
         <w:t xml:space="preserve">方案名称: </w:t>
       </w:r>
       <w:r>
-        <w:t>先机罗盘 —— 跨境新品首单前的证据决策系统</w:t>
+        <w:t>先机罗盘 —— 首单前的证据决策系统</w:t>
       </w:r>
     </w:p>
     <w:p>
@@ -470,7 +470,7 @@
         <w:t>一句话定义：</w:t>
       </w:r>
       <w:r>
-        <w:t>在中小卖家付样品费、开模、首批备货之前，用 AI 多 Agent 把分散在多平台、多语言、多数据源的市场信号编译成四张可追溯、可过期、可推翻的决策卡，将'我感觉能卖'改造成'证据支持进入 / 先验证 X / 出现 Y 则停止'。</w:t>
+        <w:t>别人告诉卖家'市场怎么样'，先机罗盘回答'现在该 Go、先 Validate，还是 Stop；依据是什么；什么情况会推翻这个结论'。面向缺少海外研究团队的中小跨境卖家，在付样品费、开模和首批备货之前，用 6 个 AI Agent 把分散在多平台、多语言、多数据源的市场信号编译成四张可追溯、可过期、可推翻的决策卡。</w:t>
       </w:r>
     </w:p>
     <w:p>
@@ -585,10 +585,10 @@
         <w:rPr>
           <w:b/>
         </w:rPr>
-        <w:t>真实案例演示：</w:t>
+        <w:t>多场景验证：</w:t>
       </w:r>
       <w:r>
-        <w:t>真实案例演示：以'宠物自动喂食器 x 巴西市场'为例，系统接入了 Amazon 商品/评论数据、Olist 巴西葡语评论与成交数据、UN Comtrade 贸易数据、ECB 汇率、NY Fed 全球供应链压力指数和 World Bank 物流绩效指数，调用 Qwen 3.7 Flash 模型抽取葡语评论中的隐性痛点，33 秒内生成四张决策卡。选品卡建议优先验证'低噪音定时喂食'差异化方向，置信度 0.85，证据 8 条（含 3 条葡语原语评论回指），失效条件为'Top 10 中公开噪音测试视频的竞品数 &gt;= 4 时重新评估'。</w:t>
+        <w:t>已完成多场景验证：(1) BR x 宠物自动喂食器（Real 模式）：接入 Amazon/Olist/Comtrade/ECB/GSCPI/LSCI + Qwen 3.7 Flash，33 秒生成，8 条证据含 3 条葡语原语回指；(2) US x 咖啡磨（Hybrid 模式）：公开数据优先，6 条证据，痛点为低残粉和刻度复现；(3) MX x 榨汁机（Mock 模式）；(4) US x 降噪耳机（Mock 模式）。证明系统不是'宠物喂食器分析 Demo'，而是可泛化的市场洞察系统。</w:t>
       </w:r>
     </w:p>
     <w:p>
@@ -951,7 +951,7 @@
         <w:t>竞品差异化：</w:t>
       </w:r>
       <w:r>
-        <w:t>竞品差异化：(1) 传统选品工具（Jungle Scout、卖家精灵等）提供的是指标和榜单，回答的是'什么卖得好'，不回答'你应该怎么进入、先验证什么、什么时候停止'。(2) 通用 AI 助手（ChatGPT、通义千问等）提供的是文字建议，没有证据链、有效期和失效条件。(3) 先机罗盘输出的是可执行的行动卡 + 可追溯的证据链 + 可验证的最小实验，定位是'决策编译层'而非'数据展示层'。</w:t>
+        <w:t>竞品差异化：(1) 传统选品工具（Jungle Scout、卖家精灵等）提供指标和榜单，回答'什么卖得好'，不回答'你应该怎么进入、先验证什么、什么时候停止'。(2) 通用 AI 助手（ChatGPT、通义千问等）提供文字建议，没有证据链、有效期和失效条件。(3) 先机罗盘输出的是可执行的行动卡 + 可追溯的证据链 + 可验证的最小实验，定位是'决策编译层'而非'数据展示层'。</w:t>
       </w:r>
     </w:p>
     <w:p/>
@@ -963,7 +963,7 @@
         <w:t>商业模式：</w:t>
       </w:r>
       <w:r>
-        <w:t>商业模式：(1) 研究任务包：按'品类 x 国家'收费，单次 200-500 元，适合低频卖家；(2) 团队订阅：月费 999-2999 元，含 20-50 次任务额度 + 协作复核 + 历史报告，适合中频卖家；(3) 持续监控订阅：月费 499 元起，定时增量 + 阈值告警 + 自动重算，适合已上线卖家。</w:t>
+        <w:t>商业模式：(1) 研究任务包：按'品类 x 国家'收费，单次 200-500 元，适合低频卖家；(2) 团队订阅：月费 999-2999 元，含 20-50 次任务额度 + 协作复核 + 历史报告；(3) 持续监控订阅：月费 499 元起，定时增量 + 阈值告警 + 自动重算。</w:t>
       </w:r>
     </w:p>
     <w:p/>
@@ -996,7 +996,7 @@
     </w:p>
     <w:p>
       <w:r>
-        <w:t>先机罗盘是面向中小跨境卖家的 AI 市场洞察决策系统。它在卖家做出不可逆投入（付样品费、开模、首批备货）之前，用 6 个 AI Agent 自动采集趋势、多语言评论、竞品价格、贸易、汇率和物流数据，编译成四张标准化决策卡。每张卡不仅告诉卖家'怎么做'，还说明'凭什么'（证据链）、'什么时候失效'（反向条件）和'先验证什么'（最小实验）。系统已在巴西宠物喂食器场景完成真实数据闭环验证。</w:t>
+        <w:t>先机罗盘是面向中小跨境卖家的 AI 市场洞察决策系统。它在卖家做出不可逆投入（付样品费、开模、首批备货）之前，用 6 个 AI Agent 自动采集趋势、多语言评论、竞品价格、贸易、汇率和物流数据，编译成四张标准化决策卡。每张卡不仅告诉卖家'怎么做'，还说明'凭什么'（证据链）、'什么时候失效'（反向条件）和'先验证什么'（最小实验）。系统已在巴西宠物喂食器（Real）和美国咖啡磨（Hybrid）两个场景完成真实/混合数据闭环验证。</w:t>
       </w:r>
     </w:p>
     <w:p>
@@ -1009,42 +1009,42 @@
     </w:p>
     <w:p>
       <w:r>
-        <w:t>1. 90 秒生成四张决策卡：输入品类和目标国家后，系统自动编排 6 个 AI Agent 并行工作，输出选品方向、定价策略、竞争打法和最小市场验证四张卡，每张卡含完整证据链和行动指引。</w:t>
+        <w:t>1. 90 秒生成四张决策卡：输入品类和目标国家后，6 个 AI Agent 并行工作，输出选品方向、定价策略、竞争打法和最小市场验证四张卡，每卡含完整证据链和行动指引。</w:t>
       </w:r>
     </w:p>
     <w:p>
       <w:r>
-        <w:t>2. 多语言隐性痛点挖掘：系统直接分析巴西葡语、西班牙语等原语评论，不经过翻译丢失信息。AI 模型只返回源评论 ID，代码取回原文，确保每条痛点都可追溯到具体用户的原话。</w:t>
+        <w:t>2. 多语言隐性痛点挖掘：直接分析巴西葡语、西班牙语等原语评论，不经翻译丢失信息。Qwen 模型只返回源评论 ID，代码取回原文（Grounding），确保每条痛点可追溯到具体用户的原话。</w:t>
       </w:r>
     </w:p>
     <w:p>
       <w:r>
-        <w:t>3. 数据真实性分级保障：三模式数据合同（离线/混合/真实），真实模式要求数据缓存、模型抽取和源记录回指同时成立，否则直接拒绝输出，不会用演示数字冒充真实发现。</w:t>
+        <w:t>3. 数据真实性分级保障：三模式数据合同（离线/混合/真实），真实模式要求数据缓存、模型抽取和源记录回指同时成立，否则直接拒绝输出，不用演示数字冒充真实发现。</w:t>
       </w:r>
     </w:p>
     <w:p>
       <w:r>
-        <w:t>4. 结论有效期与失效条件：每张卡标注 14 天有效期和具体失效条件（如'Top 10 中公开噪音测试的竞品 &gt;= 4 时重新评估'），过期后系统提示重新计算，避免卖家基于过时数据做决策。</w:t>
+        <w:t>4. 结论有效期与失效条件：每卡标注 14 天有效期和具体失效条件（如'Top 10 中公开噪音测试的竞品 &gt;= 4 时重新评估'），过期后系统提示重新计算。</w:t>
       </w:r>
     </w:p>
     <w:p>
       <w:r>
-        <w:t>5. 任务可恢复与版本锁定：调研过程中断后可从最近检查点恢复，不会因为网络波动或模型超时而重头开始。每次任务锁定数据和工具版本，确保结论可复现。</w:t>
+        <w:t>5. 任务可恢复与版本锁定：调研中断后可从最近检查点恢复。每次任务锁定数据和工具版本，确保结论可复现。</w:t>
       </w:r>
     </w:p>
     <w:p>
       <w:r>
-        <w:t>6. 经验自动沉淀与复用：卖家驳回一张卡后，系统自动提取检查模式，经过回放评测验证后注入后续同类任务。例如，卖家驳回'定价建议缺少物流成本'后，后续所有定价卡都会自动检查物流信号。</w:t>
+        <w:t>6. 经验自动沉淀与复用：卖家驳回后系统自动提取检查模式，经回放评测验证后注入后续同类任务（Skill Bank）。</w:t>
       </w:r>
     </w:p>
     <w:p>
       <w:r>
-        <w:t>7. 人工复核闭环：卖家逐卡采纳/待议/驳回并标注原因，反馈沉淀为系统长期记忆，同时驱动策略门禁调整和经验库更新。</w:t>
+        <w:t>7. 人工复核闭环：逐卡采纳/待议/驳回并标注原因，反馈驱动策略门禁调整和经验库更新。</w:t>
       </w:r>
     </w:p>
     <w:p>
       <w:r>
-        <w:t>8. 一键部署与离线可用：Docker Compose 一键启动完整系统，离线模式无需任何 API Key 即可演示完整流程，适合评审现场或客户演示。</w:t>
+        <w:t>8. 一键部署与离线可用：Docker Compose 一键启动，离线模式无需 API Key 即可完整演示。</w:t>
       </w:r>
     </w:p>
     <w:p>
@@ -1130,12 +1130,7 @@
     </w:p>
     <w:p>
       <w:r>
-        <w:t>(请在此处插入架构图截图，建议使用 docs/系统架构.md 中的 Mermaid 图渲染后截图)</w:t>
-      </w:r>
-    </w:p>
-    <w:p>
-      <w:r>
-        <w:t>系统采用事件驱动的多 Agent 协作架构：</w:t>
+        <w:t>系统采用事件驱动的多 Agent 协作架构（建议此处插入架构图截图）：</w:t>
       </w:r>
     </w:p>
     <w:p/>
@@ -1273,7 +1268,7 @@
           </w:tcPr>
           <w:p>
             <w:r>
-              <w:t>多语言评论隐性痛点抽取</w:t>
+              <w:t>多语言评论隐性痛点抽取（Real/Hybrid 模式核心链路）</w:t>
             </w:r>
           </w:p>
         </w:tc>
@@ -1327,10 +1322,10 @@
         <w:rPr>
           <w:b/>
         </w:rPr>
-        <w:t>Qwen 集成详情：</w:t>
+        <w:t>Qwen Grounding 机制：</w:t>
       </w:r>
       <w:r>
-        <w:t>Qwen 模型调用方式：系统通过 Model Adapter 层封装 Qwen API 调用，采用结构化输出约束（JSON Schema），要求模型只返回源评论 ID 列表和痛点分类，代码再根据 ID 取回原文。这种方式确保模型不会编造不存在的评论内容（Grounding），同时保留原语的完整信息。每次调用记录 prompt 指纹和模型版本，确保结论可复现。</w:t>
+        <w:t>Qwen 模型调用 Grounding 机制：系统通过 Model Adapter 层封装 Qwen API 调用，采用结构化输出约束（JSON Schema），要求模型只返回源评论 ID 列表和痛点分类，代码再根据 ID 取回原文。这种方式确保模型不会编造不存在的评论内容，同时保留原语的完整信息。每次调用记录 prompt 指纹和模型版本，确保结论可复现。Real 模式下，如果 Qwen 调用失败或返回不合规结构，任务直接拒绝，不会用规则回退冒充模型结果。</w:t>
       </w:r>
     </w:p>
     <w:p>
@@ -1343,7 +1338,7 @@
     </w:p>
     <w:p>
       <w:r>
-        <w:t>• 前端：React 19 + Vite 8 + Lucide Icons，按业务 Feature 模块化拆分（research / decision-cards / evidence / evolution）</w:t>
+        <w:t>• 前端：React 19 + Vite 8 + Lucide Icons，按业务 Feature 模块化拆分</w:t>
       </w:r>
     </w:p>
     <w:p>
@@ -1358,7 +1353,7 @@
     </w:p>
     <w:p>
       <w:r>
-        <w:t>• Agent 框架：自研事件驱动 Multi-Agent Runtime，Agent 通过 CollaborationBlackboard 共享 Artifact，不直接相互调用</w:t>
+        <w:t>• Agent 框架：自研事件驱动 Multi-Agent Runtime，Agent 通过 CollaborationBlackboard 共享 Artifact</w:t>
       </w:r>
     </w:p>
     <w:p>
@@ -1373,7 +1368,7 @@
     </w:p>
     <w:p>
       <w:r>
-        <w:t>• 治理层：Harness（Trace 审计 / SQLite Memory / Checkpoint 恢复 / Run Ledger 运行账本）+ 作用域工具注册 + 权限守卫 + 组件版本快照 + Skill Bank 经验复用</w:t>
+        <w:t>• 治理层：Harness（Trace 审计 / SQLite Memory / Checkpoint 恢复 / Run Ledger）+ 作用域工具注册 + 权限守卫 + 组件版本快照 + Skill Bank 经验复用</w:t>
       </w:r>
     </w:p>
     <w:p>
@@ -1386,7 +1381,7 @@
     </w:p>
     <w:p>
       <w:r>
-        <w:t>项目从 2026 年 7 月启动，经历六个开发阶段：概念验证（PRD + 领域模型）-&gt; 单 Agent 原型（Mock 数据跑通四卡）-&gt; 多 Agent 协作（Blackboard + 并行编排）-&gt; Harness 治理层（Trace/Memory/Checkpoint）-&gt; 真实数据接入（Amazon/Olist/Comtrade/ECB/GSCPI/LSCI）-&gt; Skill Bank 经验复用。当前代码约 6300 行（后端 5100 行 + 前端 1200 行），20 次 Git 提交，GitHub Actions CI 全绿。</w:t>
+        <w:t>项目从 2026 年 7 月启动，经历六个开发阶段：概念验证 -&gt; 单 Agent 原型 -&gt; 多 Agent 协作 -&gt; Harness 治理层 -&gt; 真实数据接入 -&gt; Skill Bank 经验复用。当前代码约 6300 行（后端 5100 行 + 前端 1200 行），21 次 Git 提交，GitHub Actions CI 全绿。</w:t>
       </w:r>
     </w:p>
     <w:p/>
@@ -1421,7 +1416,7 @@
     </w:p>
     <w:p>
       <w:r>
-        <w:t>• Skill Bank：4 个种子 Skill（市场进入检查、毛利安全检查、痛点本地化检查、过期信号重算）、BM25 检索、Validation/Holdout 回放评测、人工激活与版本回滚</w:t>
+        <w:t>• Skill Bank：4 个种子 Skill、BM25 检索、Validation/Holdout 回放评测、人工激活与版本回滚</w:t>
       </w:r>
     </w:p>
     <w:p>
@@ -1441,7 +1436,7 @@
     </w:p>
     <w:p>
       <w:r>
-        <w:t>• 5 份跨品类x跨市场 Demo 报告（BR 宠物喂食器、US 咖啡磨、MX 榨汁机、US 降噪耳机 + 1 份 Real 真实数据报告）</w:t>
+        <w:t>• 多场景 Demo 报告：BR 宠物喂食器（Real）+ US 咖啡磨（Hybrid）+ MX 榨汁机（Mock）+ US 降噪耳机（Mock）</w:t>
       </w:r>
     </w:p>
     <w:p>
@@ -1466,22 +1461,22 @@
     </w:p>
     <w:p>
       <w:r>
-        <w:t>• Runtime 职责膨胀（单文件超 600 行）-&gt; 拆分为 App Factory + 独立 Router + Feature 模块，前端 App.jsx 从 725 行降至 654 行</w:t>
+        <w:t>• Runtime 职责膨胀（单文件超 600 行）-&gt; 拆分为 App Factory + 独立 Router + Feature 模块</w:t>
       </w:r>
     </w:p>
     <w:p>
       <w:r>
-        <w:t>• 模型幻觉风险（AI 可能编造不存在的评论）-&gt; Evidence Schema + 结构门禁 + 源记录 Grounding（模型只返回 review ID，代码取回原文），门禁不通过直接拒绝发布</w:t>
+        <w:t>• 模型幻觉风险（AI 可能编造评论）-&gt; Evidence Schema + 结构门禁 + 源记录 Grounding（模型只返回 review ID，代码取回原文）</w:t>
       </w:r>
     </w:p>
     <w:p>
       <w:r>
-        <w:t>• 热更新影响运行中的任务 -&gt; 组件版本快照（Component Snapshot）锁定每个任务的 Provider/工具/策略版本 SHA-256，热更新只影响新任务</w:t>
+        <w:t>• 热更新影响运行中任务 -&gt; 组件版本快照锁定每个任务的 Provider/工具/策略版本 SHA-256</w:t>
       </w:r>
     </w:p>
     <w:p>
       <w:r>
-        <w:t>• Skill 状态管理易出错 -&gt; 引入 StrEnum 类型约束 + 轻量级状态计数器，避免全表扫描</w:t>
+        <w:t>• Skill 状态管理易出错 -&gt; 引入 StrEnum 类型约束 + 轻量级状态计数器</w:t>
       </w:r>
     </w:p>
     <w:p/>
@@ -1496,17 +1491,17 @@
     </w:p>
     <w:p>
       <w:r>
-        <w:t>• 定时市场快照 + 变化检测 + 阈值告警（当前仅支持手动刷新）</w:t>
+        <w:t>• 定时市场快照 + 变化检测 + 阈值告警</w:t>
       </w:r>
     </w:p>
     <w:p>
       <w:r>
-        <w:t>• 向量数据库（Chroma/Qdrant）增强 Skill 检索精度</w:t>
+        <w:t>• 向量数据库增强 Skill 检索精度</w:t>
       </w:r>
     </w:p>
     <w:p>
       <w:r>
-        <w:t>• 生产级任务队列和分布式事件总线（当前为单进程）</w:t>
+        <w:t>• 生产级任务队列和分布式事件总线</w:t>
       </w:r>
     </w:p>
     <w:p>
@@ -1524,7 +1519,7 @@
         <w:pStyle w:val="Heading1"/>
       </w:pPr>
       <w:r>
-        <w:t>七、提交物清单（勾选确认）</w:t>
+        <w:t>七、提交物清单</w:t>
       </w:r>
     </w:p>
     <w:p>
@@ -1534,7 +1529,7 @@
     </w:p>
     <w:p>
       <w:r>
-        <w:t>☑ 可运行的产品 Demo / 核心功能原型（Docker Compose 一键启动）</w:t>
+        <w:t>☑ 可运行的产品 Demo（Docker Compose 一键启动）</w:t>
       </w:r>
     </w:p>
     <w:p>
@@ -1544,7 +1539,7 @@
     </w:p>
     <w:p>
       <w:r>
-        <w:t>☐ 产品演示视频（待录制，建议 3-5 分钟）</w:t>
+        <w:t>☐ 产品演示视频（待录制，4 分 30 秒，业务先行）</w:t>
       </w:r>
     </w:p>
     <w:p>
@@ -1648,7 +1643,7 @@
           </w:tcPr>
           <w:p>
             <w:r>
-              <w:t>（待录制，建议 3-5 分钟，展示：输入品类 -&gt; Agent 并行工作 -&gt; 四卡输出 -&gt; 证据链查看 -&gt; 人工审核 -&gt; 策略演进 完整流程）</w:t>
+              <w:t>（待录制，4 分 30 秒，业务先行：前 60 秒商家问题 -&gt; 四卡 -&gt; 痛点 -&gt; Qwen Grounding -&gt; 人工复核 -&gt; 跨场景泛化）</w:t>
             </w:r>
           </w:p>
         </w:tc>

</xml_diff>